<commit_message>
Respaldar con citas verificadas las barreras físicas en práctica 4
Usa el artículo de Hernández Mendoza y Duana Avila (2021) leído en su
texto, con páginas, y retira la fuente no verificada.

Co-Authored-By: Claude Sonnet 5.5 <noreply@anthropic.com>
Claude-Session: https://claude.ai/code/session_01ELiiEMNxLSZU1C1isiGyKM
</commit_message>
<xml_diff>
--- a/deber3_comunicacion/Aprendizaje_N_4_corregido.docx
+++ b/deber3_comunicacion/Aprendizaje_N_4_corregido.docx
@@ -794,7 +794,7 @@
                 <w:rFonts w:eastAsia="Times New Roman"/>
                 <w:lang w:val="es-EC"/>
               </w:rPr>
-              <w:t>La comunicación humana es un proceso mediante el cual las personas intercambian ideas, sentimientos y significados, y del cual depende en gran medida la calidad de las relaciones interpersonales y profesionales. Este proceso puede verse afectado por diversas barreras que dificultan la transmisión y comprensión adecuada del mensaje (Hernández Mendoza &amp; Duana Avila, 2021). Entre ellas se encuentran las barreras físicas, relacionadas con el entorno donde ocurre la interacción, como el ruido, las distancias o la mala iluminación; las barreras semánticas, originadas por el uso inadecuado o ambiguo del lenguaje; y las barreras psicológicas, vinculadas a los estados emocionales, prejuicios o actitudes del emisor y del receptor (Hernández Mendoza &amp; Duana Avila, 2021; Ríos Pacheco et al., 2025). Se hace énfasis en las barreras físicas porque el entorno en que se da la interacción puede impedir que el mensaje se escuche y se comprenda con claridad (Hernández Mendoza &amp; Duana Avila, 2021). En una entrevista social, el ruido, las interrupciones o el uso del computador durante la atención pueden distraer a la profesional y restar atención a la persona, lo que se relaciona con la falta de escucha activa que se analiza en esta práctica.</w:t>
+              <w:t>La comunicación humana es un proceso mediante el cual las personas intercambian ideas, sentimientos y significados, y del cual depende en gran medida la calidad de las relaciones interpersonales y profesionales. Este proceso puede verse afectado por diversas barreras, entendidas como impedimentos que limitan o dificultan la comunicación y la capacidad de las personas de expresarse plenamente (Hernández Mendoza &amp; Duana Avila, 2021, p. 47). Entre ellas se encuentran las barreras físicas, relacionadas con el entorno donde ocurre la interacción; las barreras semánticas, originadas por la interpretación incorrecta o el uso inadecuado del lenguaje; y las barreras psicológicas, vinculadas a los estados emocionales y a las actitudes de agrado o rechazo hacia el emisor o el receptor (Hernández Mendoza &amp; Duana Avila, 2021, p. 48). Hernández Mendoza y Duana Avila (2021) señalan que las barreras físicas “son las interferencias que se presentan en la comunicación, tales como ruidos o murmullos los cuales no permiten escuchar al emisor” (p. 48), a las que se suman las interferencias telefónicas y la temperatura inadecuada, que impiden la adecuada comprensión del mensaje. Se hace énfasis en estas barreras porque el ambiente en que se da la interacción, con ruidos, interrupciones o distracciones visuales, puede impedir que el mensaje se escuche y se comprenda con claridad (Hernández Mendoza &amp; Duana Avila, 2021, p. 48). En una entrevista social, el ruido, las interrupciones o el uso del computador durante la atención pueden distraer a la profesional y restar atención a la persona, lo que se relaciona con la falta de escucha activa que se analiza en esta práctica.</w:t>
             </w:r>
           </w:p>
           <w:p>
@@ -2103,63 +2103,7 @@
                 <w:szCs w:val="24"/>
                 <w:lang w:val="es-EC" w:eastAsia="es-EC"/>
               </w:rPr>
-              <w:t xml:space="preserve">(18), 47-48. https://repository.uaeh.edu.mx/revistas/index.php/icea/article/download/7125/8008</w:t>
-            </w:r>
-          </w:p>
-          <w:p>
-            <w:pPr>
-              <w:spacing w:before="120" w:after="120"/>
-              <w:ind w:left="720" w:hanging="720"/>
-              <w:jc w:val="both"/>
-              <w:rPr>
-                <w:rFonts w:cs="Times New Roman"/>
-                <w:szCs w:val="24"/>
-                <w:lang w:val="es-EC" w:eastAsia="es-EC"/>
-              </w:rPr>
-            </w:pPr>
-            <w:r>
-              <w:rPr>
-                <w:rFonts w:cs="Times New Roman"/>
-                <w:szCs w:val="24"/>
-                <w:lang w:val="es-EC" w:eastAsia="es-EC"/>
-              </w:rPr>
-              <w:t xml:space="preserve">Ríos Pacheco, E. F., Páez Quintana, H. A., &amp; Barbosa Trigos, J. F. (2025). Barreras de comunicación en la educación básica y media del Catatumbo colombiano. </w:t>
-            </w:r>
-            <w:r>
-              <w:rPr>
-                <w:rFonts w:cs="Times New Roman"/>
-                <w:i/>
-                <w:iCs/>
-                <w:szCs w:val="24"/>
-                <w:lang w:val="es-EC" w:eastAsia="es-EC"/>
-              </w:rPr>
-              <w:t xml:space="preserve">Academia &amp; Derecho</w:t>
-            </w:r>
-            <w:r>
-              <w:rPr>
-                <w:rFonts w:cs="Times New Roman"/>
-                <w:szCs w:val="24"/>
-                <w:lang w:val="es-EC" w:eastAsia="es-EC"/>
-              </w:rPr>
-              <w:t xml:space="preserve">, </w:t>
-            </w:r>
-            <w:r>
-              <w:rPr>
-                <w:rFonts w:cs="Times New Roman"/>
-                <w:i/>
-                <w:iCs/>
-                <w:szCs w:val="24"/>
-                <w:lang w:val="es-EC" w:eastAsia="es-EC"/>
-              </w:rPr>
-              <w:t xml:space="preserve">16</w:t>
-            </w:r>
-            <w:r>
-              <w:rPr>
-                <w:rFonts w:cs="Times New Roman"/>
-                <w:szCs w:val="24"/>
-                <w:lang w:val="es-EC" w:eastAsia="es-EC"/>
-              </w:rPr>
-              <w:t xml:space="preserve">(30), 1-19. https://revistas.unilibre.edu.co/index.php/academia/article/view/12723</w:t>
+              <w:t xml:space="preserve">(18), 47-48. https://repository.uaeh.edu.mx/revistas/index.php/icea/issue/archive</w:t>
             </w:r>
           </w:p>
           <w:p>

</xml_diff>